<commit_message>
made graph for lab 1
</commit_message>
<xml_diff>
--- a/done/lab_1/Шаги.docx
+++ b/done/lab_1/Шаги.docx
@@ -260,15 +260,7 @@
         </w:numPr>
       </w:pPr>
       <w:r>
-        <w:t>П1</w:t>
-      </w:r>
-      <w:proofErr w:type="gramStart"/>
-      <w:r>
-        <w:t>: Если</w:t>
-      </w:r>
-      <w:proofErr w:type="gramEnd"/>
-      <w:r>
-        <w:t xml:space="preserve"> (Ф1 И Ф2) → Д1 возможно</w:t>
+        <w:t>П1: Если (Ф1 И Ф2) → Д1 возможно</w:t>
       </w:r>
     </w:p>
     <w:p>
@@ -279,15 +271,7 @@
         </w:numPr>
       </w:pPr>
       <w:r>
-        <w:t>П2</w:t>
-      </w:r>
-      <w:proofErr w:type="gramStart"/>
-      <w:r>
-        <w:t>: Если</w:t>
-      </w:r>
-      <w:proofErr w:type="gramEnd"/>
-      <w:r>
-        <w:t xml:space="preserve"> (Д1 выполнено И Ф3) → Д2 возможно</w:t>
+        <w:t>П2: Если (Д1 выполнено И Ф3) → Д2 возможно</w:t>
       </w:r>
     </w:p>
     <w:p>
@@ -298,15 +282,7 @@
         </w:numPr>
       </w:pPr>
       <w:r>
-        <w:t>П3</w:t>
-      </w:r>
-      <w:proofErr w:type="gramStart"/>
-      <w:r>
-        <w:t>: Если</w:t>
-      </w:r>
-      <w:proofErr w:type="gramEnd"/>
-      <w:r>
-        <w:t xml:space="preserve"> (Д2 выполнено И Ф4) → Д3 возможно</w:t>
+        <w:t>П3: Если (Д2 выполнено И Ф4) → Д3 возможно</w:t>
       </w:r>
     </w:p>
     <w:p>
@@ -317,15 +293,7 @@
         </w:numPr>
       </w:pPr>
       <w:r>
-        <w:t>П4</w:t>
-      </w:r>
-      <w:proofErr w:type="gramStart"/>
-      <w:r>
-        <w:t>: Если</w:t>
-      </w:r>
-      <w:proofErr w:type="gramEnd"/>
-      <w:r>
-        <w:t xml:space="preserve"> (Д2 выполнено И Ф6) → Д4 возможно</w:t>
+        <w:t>П4: Если (Д2 выполнено И Ф6) → Д4 возможно</w:t>
       </w:r>
     </w:p>
     <w:p>
@@ -336,15 +304,7 @@
         </w:numPr>
       </w:pPr>
       <w:r>
-        <w:t>П5</w:t>
-      </w:r>
-      <w:proofErr w:type="gramStart"/>
-      <w:r>
-        <w:t>: Если</w:t>
-      </w:r>
-      <w:proofErr w:type="gramEnd"/>
-      <w:r>
-        <w:t xml:space="preserve"> (Д3 выполнено И Ф7) → Д5 возможно</w:t>
+        <w:t>П5: Если (Д3 выполнено И Ф7) → Д5 возможно</w:t>
       </w:r>
     </w:p>
     <w:p>
@@ -355,15 +315,7 @@
         </w:numPr>
       </w:pPr>
       <w:r>
-        <w:t>П6</w:t>
-      </w:r>
-      <w:proofErr w:type="gramStart"/>
-      <w:r>
-        <w:t>: Если</w:t>
-      </w:r>
-      <w:proofErr w:type="gramEnd"/>
-      <w:r>
-        <w:t xml:space="preserve"> (Д2 выполнено И Ф8) → Д6 возможно</w:t>
+        <w:t>П6: Если (Д2 выполнено И Ф8) → Д6 возможно</w:t>
       </w:r>
     </w:p>
     <w:p>
@@ -374,15 +326,7 @@
         </w:numPr>
       </w:pPr>
       <w:r>
-        <w:t>П7</w:t>
-      </w:r>
-      <w:proofErr w:type="gramStart"/>
-      <w:r>
-        <w:t>: Если</w:t>
-      </w:r>
-      <w:proofErr w:type="gramEnd"/>
-      <w:r>
-        <w:t xml:space="preserve"> (Ф9 И Д4 И Д6) → Д7 возможно</w:t>
+        <w:t>П7: Если (Ф9 И Д4 И Д6) → Д7 возможно</w:t>
       </w:r>
     </w:p>
     <w:p>
@@ -393,15 +337,7 @@
         </w:numPr>
       </w:pPr>
       <w:r>
-        <w:t>П8</w:t>
-      </w:r>
-      <w:proofErr w:type="gramStart"/>
-      <w:r>
-        <w:t>: Если</w:t>
-      </w:r>
-      <w:proofErr w:type="gramEnd"/>
-      <w:r>
-        <w:t xml:space="preserve"> (Д3 И Д4 И Д5 И Д6 И Д7) → Д18 достигается</w:t>
+        <w:t>П8: Если (Д3 И Д4 И Д5 И Д6 И Д7) → Д18 достигается</w:t>
       </w:r>
     </w:p>
     <w:p>
@@ -884,6 +820,37 @@
           <w:numId w:val="4"/>
         </w:numPr>
       </w:pPr>
+      <w:hyperlink r:id="rId7" w:tgtFrame="_blank" w:history="1">
+        <w:r>
+          <w:rPr>
+            <w:rStyle w:val="a4"/>
+          </w:rPr>
+          <w:t>https://mermaid-js.github.io/mermaid-live-editor/</w:t>
+        </w:r>
+      </w:hyperlink>
+      <w:r>
+        <w:t xml:space="preserve"> </w:t>
+      </w:r>
+    </w:p>
+    <w:p>
+      <w:pPr>
+        <w:pStyle w:val="a3"/>
+        <w:numPr>
+          <w:ilvl w:val="1"/>
+          <w:numId w:val="4"/>
+        </w:numPr>
+      </w:pPr>
+      <w:hyperlink r:id="rId8" w:tgtFrame="_blank" w:history="1">
+        <w:r>
+          <w:rPr>
+            <w:rStyle w:val="a4"/>
+          </w:rPr>
+          <w:t>https://kroki.io/mermaid</w:t>
+        </w:r>
+      </w:hyperlink>
+      <w:r>
+        <w:t xml:space="preserve"> (если нужно быстро получить картинку)</w:t>
+      </w:r>
     </w:p>
     <w:sectPr>
       <w:pgSz w:w="11906" w:h="16838"/>
@@ -898,6 +865,119 @@
 <file path=word/numbering.xml><?xml version="1.0" encoding="utf-8"?>
 <w:numbering xmlns:wpc="http://schemas.microsoft.com/office/word/2010/wordprocessingCanvas" xmlns:cx="http://schemas.microsoft.com/office/drawing/2014/chartex" xmlns:cx1="http://schemas.microsoft.com/office/drawing/2015/9/8/chartex" xmlns:cx2="http://schemas.microsoft.com/office/drawing/2015/10/21/chartex" xmlns:cx3="http://schemas.microsoft.com/office/drawing/2016/5/9/chartex" xmlns:cx4="http://schemas.microsoft.com/office/drawing/2016/5/10/chartex" xmlns:cx5="http://schemas.microsoft.com/office/drawing/2016/5/11/chartex" xmlns:cx6="http://schemas.microsoft.com/office/drawing/2016/5/12/chartex" xmlns:cx7="http://schemas.microsoft.com/office/drawing/2016/5/13/chartex" xmlns:cx8="http://schemas.microsoft.com/office/drawing/2016/5/14/chartex" xmlns:mc="http://schemas.openxmlformats.org/markup-compatibility/2006" xmlns:aink="http://schemas.microsoft.com/office/drawing/2016/ink" xmlns:am3d="http://schemas.microsoft.com/office/drawing/2017/model3d" xmlns:o="urn:schemas-microsoft-com:office:office" xmlns:oel="http://schemas.microsoft.com/office/2019/extlst" xmlns:r="http://schemas.openxmlformats.org/officeDocument/2006/relationships" xmlns:m="http://schemas.openxmlformats.org/officeDocument/2006/math" xmlns:v="urn:schemas-microsoft-com:vml" xmlns:wp14="http://schemas.microsoft.com/office/word/2010/wordprocessingDrawing" xmlns:wp="http://schemas.openxmlformats.org/drawingml/2006/wordprocessingDrawing" xmlns:w10="urn:schemas-microsoft-com:office:word" xmlns:w="http://schemas.openxmlformats.org/wordprocessingml/2006/main" xmlns:w14="http://schemas.microsoft.com/office/word/2010/wordml" xmlns:w15="http://schemas.microsoft.com/office/word/2012/wordml" xmlns:w16cex="http://schemas.microsoft.com/office/word/2018/wordml/cex" xmlns:w16cid="http://schemas.microsoft.com/office/word/2016/wordml/cid" xmlns:w16="http://schemas.microsoft.com/office/word/2018/wordml" xmlns:w16sdtdh="http://schemas.microsoft.com/office/word/2020/wordml/sdtdatahash" xmlns:w16se="http://schemas.microsoft.com/office/word/2015/wordml/symex" xmlns:wpg="http://schemas.microsoft.com/office/word/2010/wordprocessingGroup" xmlns:wpi="http://schemas.microsoft.com/office/word/2010/wordprocessingInk" xmlns:wne="http://schemas.microsoft.com/office/word/2006/wordml" xmlns:wps="http://schemas.microsoft.com/office/word/2010/wordprocessingShape" mc:Ignorable="w14 w15 w16se w16cid w16 w16cex w16sdtdh wp14">
   <w:abstractNum w:abstractNumId="0" w15:restartNumberingAfterBreak="0">
+    <w:nsid w:val="2EA23538"/>
+    <w:multiLevelType w:val="multilevel"/>
+    <w:tmpl w:val="DFBA6B50"/>
+    <w:lvl w:ilvl="0">
+      <w:start w:val="1"/>
+      <w:numFmt w:val="decimal"/>
+      <w:lvlText w:val="%1."/>
+      <w:lvlJc w:val="left"/>
+      <w:pPr>
+        <w:tabs>
+          <w:tab w:val="num" w:pos="720"/>
+        </w:tabs>
+        <w:ind w:left="720" w:hanging="360"/>
+      </w:pPr>
+    </w:lvl>
+    <w:lvl w:ilvl="1">
+      <w:start w:val="1"/>
+      <w:numFmt w:val="decimal"/>
+      <w:lvlText w:val="%2)"/>
+      <w:lvlJc w:val="left"/>
+      <w:pPr>
+        <w:ind w:left="1440" w:hanging="360"/>
+      </w:pPr>
+      <w:rPr>
+        <w:rFonts w:hint="default"/>
+      </w:rPr>
+    </w:lvl>
+    <w:lvl w:ilvl="2" w:tentative="1">
+      <w:start w:val="1"/>
+      <w:numFmt w:val="decimal"/>
+      <w:lvlText w:val="%3."/>
+      <w:lvlJc w:val="left"/>
+      <w:pPr>
+        <w:tabs>
+          <w:tab w:val="num" w:pos="2160"/>
+        </w:tabs>
+        <w:ind w:left="2160" w:hanging="360"/>
+      </w:pPr>
+    </w:lvl>
+    <w:lvl w:ilvl="3" w:tentative="1">
+      <w:start w:val="1"/>
+      <w:numFmt w:val="decimal"/>
+      <w:lvlText w:val="%4."/>
+      <w:lvlJc w:val="left"/>
+      <w:pPr>
+        <w:tabs>
+          <w:tab w:val="num" w:pos="2880"/>
+        </w:tabs>
+        <w:ind w:left="2880" w:hanging="360"/>
+      </w:pPr>
+    </w:lvl>
+    <w:lvl w:ilvl="4" w:tentative="1">
+      <w:start w:val="1"/>
+      <w:numFmt w:val="decimal"/>
+      <w:lvlText w:val="%5."/>
+      <w:lvlJc w:val="left"/>
+      <w:pPr>
+        <w:tabs>
+          <w:tab w:val="num" w:pos="3600"/>
+        </w:tabs>
+        <w:ind w:left="3600" w:hanging="360"/>
+      </w:pPr>
+    </w:lvl>
+    <w:lvl w:ilvl="5" w:tentative="1">
+      <w:start w:val="1"/>
+      <w:numFmt w:val="decimal"/>
+      <w:lvlText w:val="%6."/>
+      <w:lvlJc w:val="left"/>
+      <w:pPr>
+        <w:tabs>
+          <w:tab w:val="num" w:pos="4320"/>
+        </w:tabs>
+        <w:ind w:left="4320" w:hanging="360"/>
+      </w:pPr>
+    </w:lvl>
+    <w:lvl w:ilvl="6" w:tentative="1">
+      <w:start w:val="1"/>
+      <w:numFmt w:val="decimal"/>
+      <w:lvlText w:val="%7."/>
+      <w:lvlJc w:val="left"/>
+      <w:pPr>
+        <w:tabs>
+          <w:tab w:val="num" w:pos="5040"/>
+        </w:tabs>
+        <w:ind w:left="5040" w:hanging="360"/>
+      </w:pPr>
+    </w:lvl>
+    <w:lvl w:ilvl="7" w:tentative="1">
+      <w:start w:val="1"/>
+      <w:numFmt w:val="decimal"/>
+      <w:lvlText w:val="%8."/>
+      <w:lvlJc w:val="left"/>
+      <w:pPr>
+        <w:tabs>
+          <w:tab w:val="num" w:pos="5760"/>
+        </w:tabs>
+        <w:ind w:left="5760" w:hanging="360"/>
+      </w:pPr>
+    </w:lvl>
+    <w:lvl w:ilvl="8" w:tentative="1">
+      <w:start w:val="1"/>
+      <w:numFmt w:val="decimal"/>
+      <w:lvlText w:val="%9."/>
+      <w:lvlJc w:val="left"/>
+      <w:pPr>
+        <w:tabs>
+          <w:tab w:val="num" w:pos="6480"/>
+        </w:tabs>
+        <w:ind w:left="6480" w:hanging="360"/>
+      </w:pPr>
+    </w:lvl>
+  </w:abstractNum>
+  <w:abstractNum w:abstractNumId="1" w15:restartNumberingAfterBreak="0">
     <w:nsid w:val="31D213F3"/>
     <w:multiLevelType w:val="multilevel"/>
     <w:tmpl w:val="0CCC34B0"/>
@@ -1046,7 +1126,7 @@
       </w:rPr>
     </w:lvl>
   </w:abstractNum>
-  <w:abstractNum w:abstractNumId="1" w15:restartNumberingAfterBreak="0">
+  <w:abstractNum w:abstractNumId="2" w15:restartNumberingAfterBreak="0">
     <w:nsid w:val="4F1D3E5D"/>
     <w:multiLevelType w:val="multilevel"/>
     <w:tmpl w:val="63CE74C6"/>
@@ -1195,7 +1275,7 @@
       </w:rPr>
     </w:lvl>
   </w:abstractNum>
-  <w:abstractNum w:abstractNumId="2" w15:restartNumberingAfterBreak="0">
+  <w:abstractNum w:abstractNumId="3" w15:restartNumberingAfterBreak="0">
     <w:nsid w:val="68624C11"/>
     <w:multiLevelType w:val="multilevel"/>
     <w:tmpl w:val="FE6653E0"/>
@@ -1344,7 +1424,7 @@
       </w:rPr>
     </w:lvl>
   </w:abstractNum>
-  <w:abstractNum w:abstractNumId="3" w15:restartNumberingAfterBreak="0">
+  <w:abstractNum w:abstractNumId="4" w15:restartNumberingAfterBreak="0">
     <w:nsid w:val="6C931C0C"/>
     <w:multiLevelType w:val="multilevel"/>
     <w:tmpl w:val="83749B64"/>
@@ -1493,7 +1573,7 @@
       </w:rPr>
     </w:lvl>
   </w:abstractNum>
-  <w:abstractNum w:abstractNumId="4" w15:restartNumberingAfterBreak="0">
+  <w:abstractNum w:abstractNumId="5" w15:restartNumberingAfterBreak="0">
     <w:nsid w:val="70E43164"/>
     <w:multiLevelType w:val="multilevel"/>
     <w:tmpl w:val="DFBA6B50"/>
@@ -1606,7 +1686,7 @@
       </w:pPr>
     </w:lvl>
   </w:abstractNum>
-  <w:abstractNum w:abstractNumId="5" w15:restartNumberingAfterBreak="0">
+  <w:abstractNum w:abstractNumId="6" w15:restartNumberingAfterBreak="0">
     <w:nsid w:val="71F46180"/>
     <w:multiLevelType w:val="multilevel"/>
     <w:tmpl w:val="65C0FB24"/>
@@ -1756,22 +1836,25 @@
     </w:lvl>
   </w:abstractNum>
   <w:num w:numId="1" w16cid:durableId="2085444444">
+    <w:abstractNumId w:val="4"/>
+  </w:num>
+  <w:num w:numId="2" w16cid:durableId="1473795090">
+    <w:abstractNumId w:val="1"/>
+  </w:num>
+  <w:num w:numId="3" w16cid:durableId="181014420">
+    <w:abstractNumId w:val="6"/>
+  </w:num>
+  <w:num w:numId="4" w16cid:durableId="1736659137">
+    <w:abstractNumId w:val="5"/>
+  </w:num>
+  <w:num w:numId="5" w16cid:durableId="825509688">
+    <w:abstractNumId w:val="2"/>
+  </w:num>
+  <w:num w:numId="6" w16cid:durableId="461925612">
     <w:abstractNumId w:val="3"/>
   </w:num>
-  <w:num w:numId="2" w16cid:durableId="1473795090">
+  <w:num w:numId="7" w16cid:durableId="1650936412">
     <w:abstractNumId w:val="0"/>
-  </w:num>
-  <w:num w:numId="3" w16cid:durableId="181014420">
-    <w:abstractNumId w:val="5"/>
-  </w:num>
-  <w:num w:numId="4" w16cid:durableId="1736659137">
-    <w:abstractNumId w:val="4"/>
-  </w:num>
-  <w:num w:numId="5" w16cid:durableId="825509688">
-    <w:abstractNumId w:val="1"/>
-  </w:num>
-  <w:num w:numId="6" w16cid:durableId="461925612">
-    <w:abstractNumId w:val="2"/>
   </w:num>
 </w:numbering>
 </file>

</xml_diff>